<commit_message>
Evidence-model footnote scoring, edge fixtures, ribbon tab
</commit_message>
<xml_diff>
--- a/decompilation/fixtures/footnotes-test.docx
+++ b/decompilation/fixtures/footnotes-test.docx
@@ -508,7 +508,7 @@
     <w:link w:val="Heading1Char"/>
     <w:uiPriority w:val="9"/>
     <w:qFormat/>
-    <w:rsid w:val="003117F7"/>
+    <w:rsid w:val="00401C65"/>
     <w:pPr>
       <w:keepNext/>
       <w:keepLines/>
@@ -531,7 +531,7 @@
     <w:semiHidden/>
     <w:unhideWhenUsed/>
     <w:qFormat/>
-    <w:rsid w:val="003117F7"/>
+    <w:rsid w:val="00401C65"/>
     <w:pPr>
       <w:keepNext/>
       <w:keepLines/>
@@ -554,7 +554,7 @@
     <w:semiHidden/>
     <w:unhideWhenUsed/>
     <w:qFormat/>
-    <w:rsid w:val="003117F7"/>
+    <w:rsid w:val="00401C65"/>
     <w:pPr>
       <w:keepNext/>
       <w:keepLines/>
@@ -576,7 +576,7 @@
     <w:semiHidden/>
     <w:unhideWhenUsed/>
     <w:qFormat/>
-    <w:rsid w:val="003117F7"/>
+    <w:rsid w:val="00401C65"/>
     <w:pPr>
       <w:keepNext/>
       <w:keepLines/>
@@ -599,7 +599,7 @@
     <w:semiHidden/>
     <w:unhideWhenUsed/>
     <w:qFormat/>
-    <w:rsid w:val="003117F7"/>
+    <w:rsid w:val="00401C65"/>
     <w:pPr>
       <w:keepNext/>
       <w:keepLines/>
@@ -620,7 +620,7 @@
     <w:semiHidden/>
     <w:unhideWhenUsed/>
     <w:qFormat/>
-    <w:rsid w:val="003117F7"/>
+    <w:rsid w:val="00401C65"/>
     <w:pPr>
       <w:keepNext/>
       <w:keepLines/>
@@ -643,7 +643,7 @@
     <w:semiHidden/>
     <w:unhideWhenUsed/>
     <w:qFormat/>
-    <w:rsid w:val="003117F7"/>
+    <w:rsid w:val="00401C65"/>
     <w:pPr>
       <w:keepNext/>
       <w:keepLines/>
@@ -664,7 +664,7 @@
     <w:semiHidden/>
     <w:unhideWhenUsed/>
     <w:qFormat/>
-    <w:rsid w:val="003117F7"/>
+    <w:rsid w:val="00401C65"/>
     <w:pPr>
       <w:keepNext/>
       <w:keepLines/>
@@ -687,7 +687,7 @@
     <w:semiHidden/>
     <w:unhideWhenUsed/>
     <w:qFormat/>
-    <w:rsid w:val="003117F7"/>
+    <w:rsid w:val="00401C65"/>
     <w:pPr>
       <w:keepNext/>
       <w:keepLines/>
@@ -737,7 +737,7 @@
     <w:basedOn w:val="DefaultParagraphFont"/>
     <w:link w:val="Heading1"/>
     <w:uiPriority w:val="9"/>
-    <w:rsid w:val="003117F7"/>
+    <w:rsid w:val="00401C65"/>
     <w:rPr>
       <w:rFonts w:asciiTheme="majorHAnsi" w:eastAsiaTheme="majorEastAsia" w:hAnsiTheme="majorHAnsi" w:cstheme="majorBidi"/>
       <w:color w:val="0F4761" w:themeColor="accent1" w:themeShade="BF"/>
@@ -754,7 +754,7 @@
     <w:link w:val="Heading2"/>
     <w:uiPriority w:val="9"/>
     <w:semiHidden/>
-    <w:rsid w:val="003117F7"/>
+    <w:rsid w:val="00401C65"/>
     <w:rPr>
       <w:rFonts w:asciiTheme="majorHAnsi" w:eastAsiaTheme="majorEastAsia" w:hAnsiTheme="majorHAnsi" w:cstheme="majorBidi"/>
       <w:color w:val="0F4761" w:themeColor="accent1" w:themeShade="BF"/>
@@ -771,7 +771,7 @@
     <w:link w:val="Heading3"/>
     <w:uiPriority w:val="9"/>
     <w:semiHidden/>
-    <w:rsid w:val="003117F7"/>
+    <w:rsid w:val="00401C65"/>
     <w:rPr>
       <w:rFonts w:eastAsiaTheme="majorEastAsia" w:cstheme="majorBidi"/>
       <w:color w:val="0F4761" w:themeColor="accent1" w:themeShade="BF"/>
@@ -788,7 +788,7 @@
     <w:link w:val="Heading4"/>
     <w:uiPriority w:val="9"/>
     <w:semiHidden/>
-    <w:rsid w:val="003117F7"/>
+    <w:rsid w:val="00401C65"/>
     <w:rPr>
       <w:rFonts w:eastAsiaTheme="majorEastAsia" w:cstheme="majorBidi"/>
       <w:i/>
@@ -807,7 +807,7 @@
     <w:link w:val="Heading5"/>
     <w:uiPriority w:val="9"/>
     <w:semiHidden/>
-    <w:rsid w:val="003117F7"/>
+    <w:rsid w:val="00401C65"/>
     <w:rPr>
       <w:rFonts w:eastAsiaTheme="majorEastAsia" w:cstheme="majorBidi"/>
       <w:color w:val="0F4761" w:themeColor="accent1" w:themeShade="BF"/>
@@ -824,7 +824,7 @@
     <w:link w:val="Heading6"/>
     <w:uiPriority w:val="9"/>
     <w:semiHidden/>
-    <w:rsid w:val="003117F7"/>
+    <w:rsid w:val="00401C65"/>
     <w:rPr>
       <w:rFonts w:eastAsiaTheme="majorEastAsia" w:cstheme="majorBidi"/>
       <w:i/>
@@ -843,7 +843,7 @@
     <w:link w:val="Heading7"/>
     <w:uiPriority w:val="9"/>
     <w:semiHidden/>
-    <w:rsid w:val="003117F7"/>
+    <w:rsid w:val="00401C65"/>
     <w:rPr>
       <w:rFonts w:eastAsiaTheme="majorEastAsia" w:cstheme="majorBidi"/>
       <w:color w:val="595959" w:themeColor="text1" w:themeTint="A6"/>
@@ -860,7 +860,7 @@
     <w:link w:val="Heading8"/>
     <w:uiPriority w:val="9"/>
     <w:semiHidden/>
-    <w:rsid w:val="003117F7"/>
+    <w:rsid w:val="00401C65"/>
     <w:rPr>
       <w:rFonts w:eastAsiaTheme="majorEastAsia" w:cstheme="majorBidi"/>
       <w:i/>
@@ -879,7 +879,7 @@
     <w:link w:val="Heading9"/>
     <w:uiPriority w:val="9"/>
     <w:semiHidden/>
-    <w:rsid w:val="003117F7"/>
+    <w:rsid w:val="00401C65"/>
     <w:rPr>
       <w:rFonts w:eastAsiaTheme="majorEastAsia" w:cstheme="majorBidi"/>
       <w:color w:val="272727" w:themeColor="text1" w:themeTint="D8"/>
@@ -897,7 +897,7 @@
     <w:link w:val="TitleChar"/>
     <w:uiPriority w:val="10"/>
     <w:qFormat/>
-    <w:rsid w:val="003117F7"/>
+    <w:rsid w:val="00401C65"/>
     <w:pPr>
       <w:spacing w:after="80" w:line="240" w:lineRule="auto"/>
       <w:contextualSpacing/>
@@ -915,7 +915,7 @@
     <w:basedOn w:val="DefaultParagraphFont"/>
     <w:link w:val="Title"/>
     <w:uiPriority w:val="10"/>
-    <w:rsid w:val="003117F7"/>
+    <w:rsid w:val="00401C65"/>
     <w:rPr>
       <w:rFonts w:asciiTheme="majorHAnsi" w:eastAsiaTheme="majorEastAsia" w:hAnsiTheme="majorHAnsi" w:cstheme="majorBidi"/>
       <w:spacing w:val="-10"/>
@@ -933,7 +933,7 @@
     <w:link w:val="SubtitleChar"/>
     <w:uiPriority w:val="11"/>
     <w:qFormat/>
-    <w:rsid w:val="003117F7"/>
+    <w:rsid w:val="00401C65"/>
     <w:pPr>
       <w:numPr>
         <w:ilvl w:val="1"/>
@@ -951,7 +951,7 @@
     <w:basedOn w:val="DefaultParagraphFont"/>
     <w:link w:val="Subtitle"/>
     <w:uiPriority w:val="11"/>
-    <w:rsid w:val="003117F7"/>
+    <w:rsid w:val="00401C65"/>
     <w:rPr>
       <w:rFonts w:eastAsiaTheme="majorEastAsia" w:cstheme="majorBidi"/>
       <w:color w:val="595959" w:themeColor="text1" w:themeTint="A6"/>
@@ -970,7 +970,7 @@
     <w:link w:val="QuoteChar"/>
     <w:uiPriority w:val="29"/>
     <w:qFormat/>
-    <w:rsid w:val="003117F7"/>
+    <w:rsid w:val="00401C65"/>
     <w:pPr>
       <w:spacing w:before="160"/>
       <w:jc w:val="center"/>
@@ -986,7 +986,7 @@
     <w:basedOn w:val="DefaultParagraphFont"/>
     <w:link w:val="Quote"/>
     <w:uiPriority w:val="29"/>
-    <w:rsid w:val="003117F7"/>
+    <w:rsid w:val="00401C65"/>
     <w:rPr>
       <w:rFonts w:ascii="Segoe UI" w:hAnsi="Segoe UI" w:cs="Times New Roman"/>
       <w:i/>
@@ -1004,7 +1004,7 @@
     <w:basedOn w:val="DefaultParagraphFont"/>
     <w:uiPriority w:val="21"/>
     <w:qFormat/>
-    <w:rsid w:val="003117F7"/>
+    <w:rsid w:val="00401C65"/>
     <w:rPr>
       <w:i/>
       <w:iCs/>
@@ -1018,7 +1018,7 @@
     <w:link w:val="IntenseQuoteChar"/>
     <w:uiPriority w:val="30"/>
     <w:qFormat/>
-    <w:rsid w:val="003117F7"/>
+    <w:rsid w:val="00401C65"/>
     <w:pPr>
       <w:pBdr>
         <w:top w:val="single" w:sz="4" w:space="10" w:color="0F4761" w:themeColor="accent1" w:themeShade="BF"/>
@@ -1039,7 +1039,7 @@
     <w:basedOn w:val="DefaultParagraphFont"/>
     <w:link w:val="IntenseQuote"/>
     <w:uiPriority w:val="30"/>
-    <w:rsid w:val="003117F7"/>
+    <w:rsid w:val="00401C65"/>
     <w:rPr>
       <w:rFonts w:ascii="Segoe UI" w:hAnsi="Segoe UI" w:cs="Times New Roman"/>
       <w:i/>
@@ -1057,7 +1057,7 @@
     <w:basedOn w:val="DefaultParagraphFont"/>
     <w:uiPriority w:val="32"/>
     <w:qFormat/>
-    <w:rsid w:val="003117F7"/>
+    <w:rsid w:val="00401C65"/>
     <w:rPr>
       <w:b/>
       <w:bCs/>

</xml_diff>